<commit_message>
vault backup: 2026-05-26 21:17:24
</commit_message>
<xml_diff>
--- a/IntroducaoAGestao/TrabalhoFinal/Relatorio_Final_Corrigido.docx
+++ b/IntroducaoAGestao/TrabalhoFinal/Relatorio_Final_Corrigido.docx
@@ -113,7 +113,7 @@
     </w:p>
     <w:p>
       <w:r>
-        <w:t xml:space="preserve">Formato: videoconferência via Microsoft Teams, com gravação e transcrição</w:t>
+        <w:t>Formato: videoconferência via Google Meet, com gravação e transcrição</w:t>
       </w:r>
     </w:p>
     <w:p>
@@ -173,7 +173,7 @@
         <w:t>análise</w:t>
       </w:r>
       <w:r>
-        <w:t xml:space="preserve"> vem de uma entrevista via Microsoft Teams de 42 minutos com o diretor executivo Ricardo Malucelli, formado em engenharia civil e que est</w:t>
+        <w:t xml:space="preserve"> vem de uma entrevista via Google Meet de 42 minutos com o diretor executivo Ricardo Malucelli, formado em engenharia civil e que est</w:t>
       </w:r>
       <w:r>
         <w:t>á</w:t>

</xml_diff>